<commit_message>
Keep retrieval-depth fix out of the paper narrative
The section motivates the extended frontier by the top-20 supply
confound alone; the pgvector ef_search detail stays in the repo
experiment record where it belongs.

Co-Authored-By: Claude Fable 5 <noreply@anthropic.com>
</commit_message>
<xml_diff>
--- a/papers/20260725_#TBD_ISCRAG_@Wild_EN_v4.docx
+++ b/papers/20260725_#TBD_ISCRAG_@Wild_EN_v4.docx
@@ -2694,7 +2694,7 @@
     </w:p>
     <w:p>
       <w:r>
-        <w:t>Extended frontier: large budgets with supply unconstrained. The frontier above retrieved only the top 20 units before packing — enough for chunks, but 20 facts total only ~1,300 estimated tokens, so the fact condition's larger budgets were candidate-starved rather than budget-bound. (An automated spot-check surfaced this via a second mechanism as well: pgvector's HNSW ef_search parameter defaults to 40 and silently caps result depth below the SQL limit; retrieval now raises it to the requested depth, and no previously reported experiment used a depth above 40.) A confound-free extension therefore retrieves the top 300 units for every condition — 300 facts ≈ 19k estimated tokens, 300 fixed chunks ≈ 210k, so greedy packing truncation binds at every cell — across budgets of 2,048/4,096/8,192/16,384 tokens, far below the answer model's 1M-token window. Judging uses a reproducible CLI command with frozen blind Kimi prompts.</w:t>
+        <w:t>Extended frontier: large budgets with supply unconstrained. The frontier above retrieved only the top 20 units before packing — enough for chunks, but 20 facts total only ~1,300 estimated tokens, so the fact condition's larger budgets were candidate-starved rather than budget-bound. A confound-free extension therefore retrieves the top 300 units for every condition — 300 facts ≈ 19k estimated tokens, 300 fixed chunks ≈ 210k, so greedy packing truncation binds at every cell — across budgets of 2,048/4,096/8,192/16,384 tokens, far below the answer model's 1M-token window. Judging uses a reproducible CLI command with frozen blind Kimi prompts.</w:t>
       </w:r>
     </w:p>
     <w:tbl>
@@ -4435,7 +4435,7 @@
           <w:p>
             <w:r/>
             <w:r>
-              <w:t>• ✅ Praised: new extended-frontier subsection removes the top-20 supply confound and lands the paper's strongest table — facts@2,048 (92/100) above every chunk cell through 16,384, chunk ceiling 75/100 at 7.3× cost; facts' own budget decline honestly reported as a third context-rot signature; ef_search retrieval defect disclosed in-line; judging via repo-frozen reproducible CLI command.</w:t>
+              <w:t>• ✅ Praised: new extended-frontier subsection removes the top-20 supply confound and lands the paper's strongest table — facts@2,048 (92/100) above every chunk cell through 16,384, chunk ceiling 75/100 at 7.3× cost; facts' own budget decline honestly reported as a third context-rot signature; judging via repo-frozen reproducible CLI command.</w:t>
               <w:br/>
               <w:t>• ❌ 2 / ⚠️ 6 (unchanged).</w:t>
               <w:br/>

</xml_diff>

<commit_message>
Decompose frontier-XL cells into coverage and reading accuracy
Split every condition into gold-packed coverage and correctness given
packed gold. Fixed-chunk reading accuracy stays flat (~76-79%) from
2,048 to 16,384 tokens, so chunk budget gains are mostly coverage
gains, and the dominant effect is a ~14-16-point reading-accuracy gap
between compiled facts and raw transcript already present at 2,048
tokens. This preempts the needle-in-a-haystack objection in both the
experiment record and paper v4.

Co-Authored-By: Claude Fable 5 <noreply@anthropic.com>
</commit_message>
<xml_diff>
--- a/papers/20260725_#TBD_ISCRAG_@Wild_EN_v4.docx
+++ b/papers/20260725_#TBD_ISCRAG_@Wild_EN_v4.docx
@@ -3695,6 +3695,212 @@
         </w:tc>
       </w:tr>
     </w:tbl>
+    <w:p>
+      <w:r>
+        <w:t>Decomposing each cell into retrieval coverage (was any gold-overlapping source packed?) and reading accuracy (correctness among only those questions) isolates the representation effect from a needle-in-a-haystack account:</w:t>
+      </w:r>
+    </w:p>
+    <w:tbl>
+      <w:tblPr>
+        <w:tblStyle w:val="TableGrid"/>
+        <w:tblW w:type="auto" w:w="0"/>
+        <w:tblLook w:firstColumn="1" w:firstRow="1" w:lastColumn="0" w:lastRow="0" w:noHBand="0" w:noVBand="1" w:val="04A0"/>
+      </w:tblPr>
+      <w:tblGrid>
+        <w:gridCol w:w="2880"/>
+        <w:gridCol w:w="2880"/>
+        <w:gridCol w:w="2880"/>
+      </w:tblGrid>
+      <w:tr>
+        <w:tc>
+          <w:tcPr>
+            <w:tcW w:type="dxa" w:w="2880"/>
+          </w:tcPr>
+          <w:p>
+            <w:r/>
+            <w:r>
+              <w:rPr>
+                <w:b/>
+              </w:rPr>
+              <w:t>Representation</w:t>
+            </w:r>
+          </w:p>
+        </w:tc>
+        <w:tc>
+          <w:tcPr>
+            <w:tcW w:type="dxa" w:w="2880"/>
+          </w:tcPr>
+          <w:p>
+            <w:r/>
+            <w:r>
+              <w:rPr>
+                <w:b/>
+              </w:rPr>
+              <w:t>Gold packed @2k/4k/8k/16k</w:t>
+            </w:r>
+          </w:p>
+        </w:tc>
+        <w:tc>
+          <w:tcPr>
+            <w:tcW w:type="dxa" w:w="2880"/>
+          </w:tcPr>
+          <w:p>
+            <w:r/>
+            <w:r>
+              <w:rPr>
+                <w:b/>
+              </w:rPr>
+              <w:t>Read-acc given gold @2k/4k/8k/16k</w:t>
+            </w:r>
+          </w:p>
+        </w:tc>
+      </w:tr>
+      <w:tr>
+        <w:tc>
+          <w:tcPr>
+            <w:tcW w:type="dxa" w:w="2880"/>
+          </w:tcPr>
+          <w:p>
+            <w:r/>
+            <w:r>
+              <w:t>Facts + quote</w:t>
+            </w:r>
+          </w:p>
+        </w:tc>
+        <w:tc>
+          <w:tcPr>
+            <w:tcW w:type="dxa" w:w="2880"/>
+          </w:tcPr>
+          <w:p>
+            <w:r/>
+            <w:r>
+              <w:t>100 / 100 / 100 / 100</w:t>
+            </w:r>
+          </w:p>
+        </w:tc>
+        <w:tc>
+          <w:tcPr>
+            <w:tcW w:type="dxa" w:w="2880"/>
+          </w:tcPr>
+          <w:p>
+            <w:r/>
+            <w:r>
+              <w:t>92.0 / 87.0 / 88.0 / 86.0</w:t>
+            </w:r>
+          </w:p>
+        </w:tc>
+      </w:tr>
+      <w:tr>
+        <w:tc>
+          <w:tcPr>
+            <w:tcW w:type="dxa" w:w="2880"/>
+          </w:tcPr>
+          <w:p>
+            <w:r/>
+            <w:r>
+              <w:t>Fixed chunks</w:t>
+            </w:r>
+          </w:p>
+        </w:tc>
+        <w:tc>
+          <w:tcPr>
+            <w:tcW w:type="dxa" w:w="2880"/>
+          </w:tcPr>
+          <w:p>
+            <w:r/>
+            <w:r>
+              <w:t>80 / 88 / 90 / 95</w:t>
+            </w:r>
+          </w:p>
+        </w:tc>
+        <w:tc>
+          <w:tcPr>
+            <w:tcW w:type="dxa" w:w="2880"/>
+          </w:tcPr>
+          <w:p>
+            <w:r/>
+            <w:r>
+              <w:t>76.3 / 78.4 / 75.6 / 78.9</w:t>
+            </w:r>
+          </w:p>
+        </w:tc>
+      </w:tr>
+      <w:tr>
+        <w:tc>
+          <w:tcPr>
+            <w:tcW w:type="dxa" w:w="2880"/>
+          </w:tcPr>
+          <w:p>
+            <w:r/>
+            <w:r>
+              <w:t>Turn-aware chunks</w:t>
+            </w:r>
+          </w:p>
+        </w:tc>
+        <w:tc>
+          <w:tcPr>
+            <w:tcW w:type="dxa" w:w="2880"/>
+          </w:tcPr>
+          <w:p>
+            <w:r/>
+            <w:r>
+              <w:t>75 / 82 / 91 / 95</w:t>
+            </w:r>
+          </w:p>
+        </w:tc>
+        <w:tc>
+          <w:tcPr>
+            <w:tcW w:type="dxa" w:w="2880"/>
+          </w:tcPr>
+          <w:p>
+            <w:r/>
+            <w:r>
+              <w:t>77.3 / 72.0 / 70.3 / 78.9</w:t>
+            </w:r>
+          </w:p>
+        </w:tc>
+      </w:tr>
+      <w:tr>
+        <w:tc>
+          <w:tcPr>
+            <w:tcW w:type="dxa" w:w="2880"/>
+          </w:tcPr>
+          <w:p>
+            <w:r/>
+            <w:r>
+              <w:t>Semantic chunks</w:t>
+            </w:r>
+          </w:p>
+        </w:tc>
+        <w:tc>
+          <w:tcPr>
+            <w:tcW w:type="dxa" w:w="2880"/>
+          </w:tcPr>
+          <w:p>
+            <w:r/>
+            <w:r>
+              <w:t>78 / 85 / 88 / 95</w:t>
+            </w:r>
+          </w:p>
+        </w:tc>
+        <w:tc>
+          <w:tcPr>
+            <w:tcW w:type="dxa" w:w="2880"/>
+          </w:tcPr>
+          <w:p>
+            <w:r/>
+            <w:r>
+              <w:t>78.2 / 70.6 / 72.7 / 73.7</w:t>
+            </w:r>
+          </w:p>
+        </w:tc>
+      </w:tr>
+    </w:tbl>
+    <w:p>
+      <w:r>
+        <w:t>If large-budget chunk cells merely measured the answer model's haystack weakness, reading accuracy given packed gold would collapse with budget; instead it is roughly flat for fixed chunks (~76–79%) from 2,048 to 16,384 tokens, and chunk budget gains are mostly coverage gains (80%→95%). The dominant effect is a ~14–16-point reading-accuracy gap between compiled facts and raw transcript that is already present at 2,048 tokens, where haystack pressure is minimal; long-context degradation appears as a secondary effect on top (the fact conditions' own decline occurs at fixed 100% coverage and is therefore pure reading degradation with volume).</w:t>
+      </w:r>
+    </w:p>
     <w:p>
       <w:r>
         <w:t>Three results stand out. First, the 2,048-token fact cell (92/100 correct at 2,233 actual tokens) exceeds every chunk cell at every budget; the best any chunk condition achieves is 75/100 at roughly 16,300 tokens — 7.3× the cost for 17 fewer correct answers — and facts' worst cell (86/100) still exceeds chunks' best. Second, with supply unconstrained, fact accuracy declines as budget grows (92→87→88→86; paired 2,048→16,384: 7 regressions vs 2 gains), so compiled context is itself subject to long-context degradation — its optimum simply sits near 2k tokens. Third, chunks convert budget into accuracy (turn-aware gains 20 paired questions from 2,048 to 16,384) but non-monotonically (fixed dips at 8,192), and a qualitative audit verified individual correct-to-insufficient flips with the gold evidence still packed. The prescription the table supports is not that facts tolerate large contexts better, but that facts make large contexts unnecessary.</w:t>

</xml_diff>

<commit_message>
Ground the introduction in a real chunk-versus-fact example
Show the Chappelle-Nadal turn as its raw fixed-chunk window beside
the compiled fact-plus-quote units, with the pronoun, attribution,
and token-size contrast spelled out from actual corpus data.

Co-Authored-By: Claude Fable 5 <noreply@anthropic.com>
</commit_message>
<xml_diff>
--- a/papers/20260725_#TBD_ISCRAG_@Wild_EN_v4.docx
+++ b/papers/20260725_#TBD_ISCRAG_@Wild_EN_v4.docx
@@ -1534,6 +1534,37 @@
     <w:p>
       <w:r>
         <w:t>In this paper we present ISC-RAG (Ingest-time Semantic Compilation for RAG). ISC-RAG extracts high-recall factual and opinion claims from dialogue transcripts, discards any claim whose exact supporting quotation cannot be found verbatim in the source, attaches speaker attribution and turn-span provenance to every surviving claim, and rewrites claims so that resolvable pronouns and local references name their antecedents. The compiled fact — claim plus verified quote — is the retrieval payload the answer model reads.</w:t>
+      </w:r>
+    </w:p>
+    <w:p>
+      <w:r>
+        <w:t>A real example from our corpus makes the contrast concrete. In a CNN segment, the anchor pivots mid-interview:</w:t>
+      </w:r>
+    </w:p>
+    <w:p>
+      <w:pPr>
+        <w:pStyle w:val="IntenseQuote"/>
+      </w:pPr>
+      <w:r>
+        <w:t>“…I do want to ask you about a Missouri Democratic senator, Senator Maria Chappelle Nadal, who wrote, I hope Trump is assassinated. Here are some people who now — by the way, she ultimately removed that tweet. There are some people who say that this state senator should step down…” (BERMAN, turn 10)</w:t>
+      </w:r>
+    </w:p>
+    <w:p>
+      <w:r>
+        <w:t>A fixed chunk containing this sentence is a 2,880-character window spanning turns 7–14: the tweet discussion is embedded between an exchange about Confederate statues and the congressman's reaction, and the claim's subject appears as “she.” A turn-aware chunk keeps whole turns and a semantic chunk breaks near a topic shift, but both likewise return raw multi-turn transcript in which the answer model must locate the claim and resolve its pronoun. ISC-RAG instead compiles turn 10 into separate fact-plus-quote units, one per claim:</w:t>
+      </w:r>
+    </w:p>
+    <w:p>
+      <w:pPr>
+        <w:pStyle w:val="IntenseQuote"/>
+      </w:pPr>
+      <w:r>
+        <w:t>Fact: Senator Maria Chappelle Nadal wrote “I hope Trump is assassinated.” — Fact: Senator Maria Chappelle Nadal ultimately removed the tweet. — Supporting quote: “she ultimately removed that tweet” — BERMAN, turn 10</w:t>
+      </w:r>
+    </w:p>
+    <w:p>
+      <w:r>
+        <w:t>A question like “Did Chappelle-Nadal take the tweet down?” now matches a ~20-token unit whose subject is named and whose evidence is a verbatim, checkable span — instead of a ~700-token window in which the fact is one clause of an aside.</w:t>
       </w:r>
     </w:p>
     <w:p>

</xml_diff>

<commit_message>
Use the retail-analyst example throughout the paper
Replace the tweet example with the Dubay big-box-retailers claim in
the introduction and the coreference mechanism callback: a double
pronoun resolution ("I" to the named analyst, "they" to the retailers)
from a 3,987-character fixed window, verified against the corpus.

Co-Authored-By: Claude Fable 5 <noreply@anthropic.com>
</commit_message>
<xml_diff>
--- a/papers/20260725_#TBD_ISCRAG_@Wild_EN_v4.docx
+++ b/papers/20260725_#TBD_ISCRAG_@Wild_EN_v4.docx
@@ -1538,7 +1538,7 @@
     </w:p>
     <w:p>
       <w:r>
-        <w:t>A real example from our corpus makes the contrast concrete. In a CNN segment, the anchor pivots mid-interview:</w:t>
+        <w:t>A real example from our corpus makes the contrast concrete. In a CNN segment on Amazon's growth, a retail analyst assesses the traditional chains:</w:t>
       </w:r>
     </w:p>
     <w:p>
@@ -1546,12 +1546,12 @@
         <w:pStyle w:val="IntenseQuote"/>
       </w:pPr>
       <w:r>
-        <w:t>“…I do want to ask you about a Missouri Democratic senator, Senator Maria Chappelle Nadal, who wrote, I hope Trump is assassinated. Here are some people who now — by the way, she ultimately removed that tweet. There are some people who say that this state senator should step down…” (BERMAN, turn 10)</w:t>
+        <w:t>“…Walmart, Target, the big box retailers are still really well-run companies but they are behind. They're behind Amazon. Amazon is much further along in the online retail space. I think they can catch up and they still do have certain advantages…” (DUBAY, turn 8)</w:t>
       </w:r>
     </w:p>
     <w:p>
       <w:r>
-        <w:t>A fixed chunk containing this sentence is a 2,880-character window spanning turns 7–14: the tweet discussion is embedded between an exchange about Confederate statues and the congressman's reaction, and the claim's subject appears as “she.” A turn-aware chunk keeps whole turns and a semantic chunk breaks near a topic shift, but both likewise return raw multi-turn transcript in which the answer model must locate the claim and resolve its pronoun. ISC-RAG instead compiles turn 10 into separate fact-plus-quote units, one per claim:</w:t>
+        <w:t>A fixed chunk containing this sentence is a 3,987-character window spanning turns 0–11: the claim sits among revenue comparisons (“$67 billion compared to $10 billion”), anchor questions, and hedged analysis, and both the claim's speaker and its subject appear only as pronouns — “I” and “they.” A turn-aware chunk keeps whole turns and a semantic chunk breaks near a topic shift, but both likewise return raw multi-turn transcript in which the answer model must locate the claim and resolve its references. ISC-RAG instead compiles the turn into fact-plus-quote units, one per claim:</w:t>
       </w:r>
     </w:p>
     <w:p>
@@ -1559,12 +1559,12 @@
         <w:pStyle w:val="IntenseQuote"/>
       </w:pPr>
       <w:r>
-        <w:t>Fact: Senator Maria Chappelle Nadal wrote “I hope Trump is assassinated.” — Fact: Senator Maria Chappelle Nadal ultimately removed the tweet. — Supporting quote: “she ultimately removed that tweet” — BERMAN, turn 10</w:t>
+        <w:t>Fact: Dubay thinks big box retailers can catch up to Amazon. — Supporting quote: “I think they can catch up” — DUBAY, turn 8</w:t>
       </w:r>
     </w:p>
     <w:p>
       <w:r>
-        <w:t>A question like “Did Chappelle-Nadal take the tweet down?” now matches a ~20-token unit whose subject is named and whose evidence is a verbatim, checkable span — instead of a ~700-token window in which the fact is one clause of an aside.</w:t>
+        <w:t>Both pronouns are resolved at ingest — “I” to the named speaker and “they” to the retailers under discussion — with the verbatim source span retained as checkable evidence. A question like “Who thought traditional retailers could catch up to Amazon?” now matches a ~15-token unit whose speaker and subject are named, instead of a ~1,000-token window in which the claim is five words inside an analyst's assessment.</w:t>
       </w:r>
     </w:p>
     <w:p>
@@ -4381,7 +4381,7 @@
     </w:p>
     <w:p>
       <w:r>
-        <w:t>Where the advantage concentrates. Qualitative audit of fact-win cases identifies four mechanisms: attribution (claims arrive with normalized speakers, so respondent vs. questioner needs no reconstruction), coreference (“she ultimately removed that tweet” is retrieved as “Senator Maria Chappelle-Nadal ultimately removed the tweet”), claim salience (a compact proposition matches its question without competing broadcast vocabulary), and opinion coverage (explicit judgments and predictions widen the answerable surface).</w:t>
+        <w:t>Where the advantage concentrates. Qualitative audit of fact-win cases identifies four mechanisms: attribution (claims arrive with normalized speakers, so respondent vs. questioner needs no reconstruction), coreference (as in the introduction's example, “I think they can catch up” is retrieved as “Dubay thinks big box retailers can catch up to Amazon”), claim salience (a compact proposition matches its question without competing broadcast vocabulary), and opinion coverage (explicit judgments and predictions widen the answerable surface).</w:t>
       </w:r>
     </w:p>
     <w:p>

</xml_diff>

<commit_message>
Fill in first-author affiliation
Kyle Wild: Chief Technology Officer, Endgame Labs; Visiting
Researcher, Asia AI Institute, Musashino University. ORCID still
flagged pending.

Co-Authored-By: Claude Fable 5 <noreply@anthropic.com>
</commit_message>
<xml_diff>
--- a/papers/20260725_#TBD_ISCRAG_@Wild_EN_v4.docx
+++ b/papers/20260725_#TBD_ISCRAG_@Wild_EN_v4.docx
@@ -408,16 +408,16 @@
           <w:p>
             <w:r/>
             <w:r>
-              <w:t xml:space="preserve">Kyle Wild (first author; ⚠️ affiliation/ORCID </w:t>
+              <w:t xml:space="preserve">Kyle Wild (first author) — Chief Technology Officer, Endgame Labs; Visiting Researcher, Asia AI Institute, Musashino University </w:t>
             </w:r>
             <w:r>
               <w:rPr>
                 <w:highlight w:val="yellow"/>
               </w:rPr>
-              <w:t>〔FQ-2〕</w:t>
-            </w:r>
-            <w:r>
-              <w:t>); Yusuke Takahashi — Faculty of Data Science, Asia AI Institute, Musashino University / AIx, Inc., Tokyo, Japan — https://orcid.org/0009-0006-8351-2280</w:t>
+              <w:t>〔ORCID pending〕</w:t>
+            </w:r>
+            <w:r>
+              <w:t>; Yusuke Takahashi — Faculty of Data Science, Asia AI Institute, Musashino University / AIx, Inc., Tokyo, Japan — https://orcid.org/0009-0006-8351-2280</w:t>
             </w:r>
           </w:p>
         </w:tc>

</xml_diff>

<commit_message>
Add multi-fact selective-retrieval example to introduction
One Ban Ki-moon turn compiles into five separate facts inside a
3,981-character fixed window; the fact index retrieves only the
claim a question asks about, while a chunk index drags the whole
bundle. The sibling-rank-competition cost is flagged candidly.

Co-Authored-By: Claude Fable 5 <noreply@anthropic.com>
</commit_message>
<xml_diff>
--- a/papers/20260725_#TBD_ISCRAG_@Wild_EN_v4.docx
+++ b/papers/20260725_#TBD_ISCRAG_@Wild_EN_v4.docx
@@ -1556,6 +1556,24 @@
     <w:p>
       <w:r>
         <w:t>Both pronouns are resolved at ingest — “I” to the named speaker and “they” to the retailers under discussion — with the verbatim source span retained as checkable evidence. A question like “Who thought traditional retailers could catch up to Amazon?” now matches a ~15-token unit whose speaker and subject are named, instead of a ~1,000-token window in which the claim is five words inside an analyst's assessment.</w:t>
+      </w:r>
+    </w:p>
+    <w:p>
+      <w:r>
+        <w:t>Compilation also changes what a single retrieval must carry. One turn frequently yields several distinct claims: in an interview after the Haiti earthquake, one Ban Ki-moon turn compiles into five separate facts, among them:</w:t>
+      </w:r>
+    </w:p>
+    <w:p>
+      <w:pPr>
+        <w:pStyle w:val="IntenseQuote"/>
+      </w:pPr>
+      <w:r>
+        <w:t>Fact: Ban Ki-moon met President Preval yesterday. — quote: “I met President Preval yesterday” — Fact: Ban Ki-moon believes sovereign, primary sovereignty should rest with the Haitian government. — Fact: Ban Ki-moon believes major government institutions have been devastated, including the presidential palace.</w:t>
+      </w:r>
+    </w:p>
+    <w:p>
+      <w:r>
+        <w:t>The fixed chunk containing this turn is a 3,981-character window spanning turns 15–33. Because each fact is indexed separately, a question about the presidential palace retrieves that claim alone: the answer model is not handed Ban Ki-moon's four other assertions — let alone the nineteen-turn neighborhood — merely because they share a window. A chunk index cannot make that selection; any question touching one of the five claims drags in all of them and their surroundings. (The same granularity has a cost we return to later: facts from the same turn compete with one another for retrieval rank.)</w:t>
       </w:r>
     </w:p>
     <w:p>

</xml_diff>

<commit_message>
Record the RQ4 model-generality sweep
Kimi K2.6 and GLM 5.2 as answer models on facts, fixed, and turn-aware
chunks at the 2,048/16,384 budget endpoints, cross-judged so no model
judges its own answers. Facts lead every model at every matched
budget; facts at 2,048 beat chunks at 16,384 for all three models at
roughly 13% of the tokens, and Flash-specific budget degradation does
not reproduce on the stronger readers. Paper v4 integrates the result
and narrows the model limitation to extraction.

Co-Authored-By: Claude Fable 5 <noreply@anthropic.com>
</commit_message>
<xml_diff>
--- a/papers/20260725_#TBD_ISCRAG_@Wild_EN_v4.docx
+++ b/papers/20260725_#TBD_ISCRAG_@Wild_EN_v4.docx
@@ -3948,6 +3948,11 @@
     </w:p>
     <w:p>
       <w:r>
+        <w:t>Model generality. To test whether these effects are artifacts of one answer model, the endpoint cells (facts, fixed, turn-aware at 2,048 and 16,384) were rerun with Kimi K2.6 and GLM 5.2 as answer models, cross-judged so no model judges its own answers. Facts lead every model at 2,048 (Kimi 90 vs 70–74; GLM 98 vs 72–75). Stronger readers recover much of the raw-transcript penalty at 16,384 (GLM chunks reach 91/100; Kimi 87/100) — Flash's budget-driven degradation does not reproduce on them at these volumes — but the gap never inverts, and facts at 2,048 beat chunks at 16,384 for all three models (92 vs 75; 90 vs 87; 98 vs 91) at roughly 13% of the tokens. The cheapest configuration tested, Flash reading facts at a 2,048 budget (92/100, ~2,233 tokens), outperforms the most expensive chunk configuration, GLM 5.2 reading chunks at 16,384 (91/100, ~16,200 tokens): compilation lets a small model with a small context match a large model with a large one.</w:t>
+      </w:r>
+    </w:p>
+    <w:p>
+      <w:r>
         <w:t>Depth curve: coverage and cost at uncapped top-k. To separate the budget manipulation from retrieval depth itself, a second controlled sweep retrieves exactly the top k in {1, 3, 5, 10, 20, 30} units per question with no packing cap, passing everything retrieved to the answer model (24 conditions; 2,400 answers; 4,800 independent judgments; DeepSeek V4 Flash as both answerer and — a deliberate development shortcut flagged in Limitations — automated judge). A question counts only when both screens pass: semantic correctness and direct source support.</w:t>
       </w:r>
     </w:p>
@@ -4436,7 +4441,7 @@
         <w:t>〔human labels pending — FQ-5〕</w:t>
       </w:r>
       <w:r>
-        <w:t>, and the depth sweep uses DeepSeek Flash to judge DeepSeek Flash outputs — a self-model screen whose absolute values should not be compared across experiments; the confirmatory run will preserve the protocol with a different judge and human calibration. (3) Single corpus and genre: MediaSum is edited broadcast dialogue, not spontaneous workplace conversation. (4) Gold-turn-overlap leniency. (5) Single answer/extraction model pairing; a model-generality extension (Kimi K2.6 and GLM 5.2 as answer models at the 2,048 and 16,384 budgets, cross-judged so no model judges its own answers) is in progress. (6) No statistical testing yet: counts are reported without tests or intervals, consistent with the pilot phase; the follow-up version requires tests, effect sizes, and an ablation over pipeline passes (validation gate on/off; rewrite on/off; quote-in-embedding on/off).</w:t>
+        <w:t>, and the depth sweep uses DeepSeek Flash to judge DeepSeek Flash outputs — a self-model screen whose absolute values should not be compared across experiments; the confirmatory run will preserve the protocol with a different judge and human calibration. (3) Single corpus and genre: MediaSum is edited broadcast dialogue, not spontaneous workplace conversation. (4) Gold-turn-overlap leniency. (5) Extraction remains single-model; the answer side is now tested across three models, but the fact index itself was produced by one extraction configuration. (6) No statistical testing yet: counts are reported without tests or intervals, consistent with the pilot phase; the follow-up version requires tests, effect sizes, and an ablation over pipeline passes (validation gate on/off; rewrite on/off; quote-in-embedding on/off).</w:t>
       </w:r>
     </w:p>
     <w:p>

</xml_diff>

<commit_message>
Verify Token Tax and Mem0 author lists
Hamilton et al. (arXiv:2606.20898) and Chhikara et al.
(arXiv:2504.19413), checked against arXiv landing pages.

Co-Authored-By: Claude Fable 5 <noreply@anthropic.com>
</commit_message>
<xml_diff>
--- a/papers/20260725_#TBD_ISCRAG_@Wild_EN_v4.docx
+++ b/papers/20260725_#TBD_ISCRAG_@Wild_EN_v4.docx
@@ -1001,13 +1001,7 @@
           <w:p>
             <w:r/>
             <w:r>
-              <w:rPr>
-                <w:highlight w:val="yellow"/>
-              </w:rPr>
-              <w:t>〔verify authors〕</w:t>
-            </w:r>
-            <w:r>
-              <w:t xml:space="preserve"> Token Tax, arXiv:2606.20898 (preprint)</w:t>
+              <w:t>Hamilton et al. 2026, Token Tax (arXiv preprint)</w:t>
             </w:r>
           </w:p>
         </w:tc>
@@ -1029,7 +1023,7 @@
           <w:p>
             <w:r/>
             <w:r>
-              <w:t>⚠️ verify</w:t>
+              <w:t>OK (verified 2026-07-26)</w:t>
             </w:r>
           </w:p>
         </w:tc>
@@ -1329,13 +1323,7 @@
           <w:p>
             <w:r/>
             <w:r>
-              <w:rPr>
-                <w:highlight w:val="yellow"/>
-              </w:rPr>
-              <w:t>〔verify authors〕</w:t>
-            </w:r>
-            <w:r>
-              <w:t xml:space="preserve"> Mem0, arXiv:2504.19413 (preprint)</w:t>
+              <w:t>Chhikara et al. 2025, Mem0 (arXiv preprint)</w:t>
             </w:r>
           </w:p>
         </w:tc>
@@ -1357,7 +1345,7 @@
           <w:p>
             <w:r/>
             <w:r>
-              <w:t>⚠️ verify</w:t>
+              <w:t>OK (verified 2026-07-26)</w:t>
             </w:r>
           </w:p>
         </w:tc>
@@ -4520,16 +4508,7 @@
     </w:p>
     <w:p>
       <w:r>
-        <w:t xml:space="preserve">[9] </w:t>
-      </w:r>
-      <w:r>
-        <w:rPr>
-          <w:highlight w:val="yellow"/>
-        </w:rPr>
-        <w:t>〔verify authors〕</w:t>
-      </w:r>
-      <w:r>
-        <w:t>, “The Token Tax of Epistemic Accuracy: RAG vs Long-Context,” arXiv:2606.20898, 2026 (preprint).</w:t>
+        <w:t>[9] A. Hamilton et al., “The Token Tax of Epistemic Accuracy: Comparing RAG and Long-Context Architectures for Document-Grounded Generative AI Applications,” arXiv:2606.20898, 2026 (preprint).</w:t>
       </w:r>
     </w:p>
     <w:p>
@@ -4564,16 +4543,7 @@
     </w:p>
     <w:p>
       <w:r>
-        <w:t xml:space="preserve">[16] </w:t>
-      </w:r>
-      <w:r>
-        <w:rPr>
-          <w:highlight w:val="yellow"/>
-        </w:rPr>
-        <w:t>〔verify authors〕</w:t>
-      </w:r>
-      <w:r>
-        <w:t>, “Mem0: Building Production-Ready AI Agents with Scalable Long-Term Memory,” arXiv:2504.19413, 2025 (preprint).</w:t>
+        <w:t>[16] P. Chhikara et al., “Mem0: Building Production-Ready AI Agents with Scalable Long-Term Memory,” arXiv:2504.19413, 2025 (preprint).</w:t>
       </w:r>
     </w:p>
     <w:p>

</xml_diff>